<commit_message>
docs(bd): playbook Channel 5 precision - SE enters via the design team
Deep-verify corrected the Cowichan framing: Bush Bohlman is the alliance design
team''s structural engineer (sub-consultant), NOT a formal alliance signatory.
Channel-5 play re-worded accordingly: the pursuit target is the architect
assembling the alliance design team, not the alliance itself. Also: hospital
renamed Quw''utsun Valley (~$1.5B, ~90% complete); UHNBC structural verified
genuinely unannounced as of Jul 2026.

Co-Authored-By: Claude Fable 5 <noreply@anthropic.com>
</commit_message>
<xml_diff>
--- a/docs/KOR-Structural-Seat-Playbook-2026-07-01.docx
+++ b/docs/KOR-Structural-Seat-Playbook-2026-07-01.docx
@@ -34,7 +34,7 @@
     </w:p>
     <w:p>
       <w:r>
-        <w:pict w14:anchorId="33A8261E">
+        <w:pict w14:anchorId="76CDEF53">
           <v:rect id="_x0000_i1025" style="width:0;height:1.5pt" o:hralign="center" o:hrstd="t" o:hr="t"/>
         </w:pict>
       </w:r>
@@ -1026,7 +1026,7 @@
     </w:tbl>
     <w:p>
       <w:r>
-        <w:pict w14:anchorId="54CB2517">
+        <w:pict w14:anchorId="55634CF2">
           <v:rect id="_x0000_i1026" style="width:0;height:1.5pt" o:hralign="center" o:hrstd="t" o:hr="t"/>
         </w:pict>
       </w:r>
@@ -1406,47 +1406,37 @@
         <w:t>How it works:</w:t>
       </w:r>
       <w:r>
-        <w:t xml:space="preserve"> BC health capital increasingly uses alliance contracting. Participants — including, sometimes, a structural firm — are </w:t>
-      </w:r>
-      <w:r>
-        <w:rPr>
-          <w:b/>
-          <w:bCs/>
-        </w:rPr>
-        <w:t>named at alliance formation</w:t>
-      </w:r>
-      <w:r>
-        <w:t xml:space="preserve">. The decisive verified pattern: </w:t>
-      </w:r>
-      <w:r>
-        <w:rPr>
-          <w:b/>
-          <w:bCs/>
-        </w:rPr>
-        <w:t>the structural participant gets named only when the design lead lacks in-house structural.</w:t>
-      </w:r>
-      <w:r>
-        <w:t xml:space="preserve"> Cowichan District Hospital: architect Parkin (no in-house SE) → </w:t>
-      </w:r>
-      <w:r>
-        <w:rPr>
-          <w:b/>
-          <w:bCs/>
-        </w:rPr>
-        <w:t>Bush Bohlman named as the structural participant.</w:t>
-      </w:r>
-      <w:r>
-        <w:t xml:space="preserve"> UHNBC: DIALOG BC (engineering in its legal name) → </w:t>
-      </w:r>
-      <w:r>
-        <w:rPr>
-          <w:b/>
-          <w:bCs/>
-        </w:rPr>
-        <w:t>no structural participant named</w:t>
-      </w:r>
-      <w:r>
-        <w:t xml:space="preserve"> — the seat lives inside the design lead. </w:t>
+        <w:t xml:space="preserve"> BC health capital increasingly uses alliance contracting. The formal alliance signatories are few (owner, builder, architect, agencies) — </w:t>
+      </w:r>
+      <w:r>
+        <w:rPr>
+          <w:b/>
+          <w:bCs/>
+        </w:rPr>
+        <w:t>the structural engineer enters as part of the design team the architect assembles</w:t>
+      </w:r>
+      <w:r>
+        <w:t xml:space="preserve">, decided around alliance formation. Verified: Cowichan/Quw’utsun Valley Hospital (~$1.5B, ~90% complete): architect Parkin (no in-house SE) → </w:t>
+      </w:r>
+      <w:r>
+        <w:rPr>
+          <w:b/>
+          <w:bCs/>
+        </w:rPr>
+        <w:t>Bush Bohlman as the design team’s structural engineer</w:t>
+      </w:r>
+      <w:r>
+        <w:t xml:space="preserve"> (a sub-consultant seat, not a signatory — the distinction matters for how you pursue it). UHNBC: DIALOG BC (engineering in-house) → </w:t>
+      </w:r>
+      <w:r>
+        <w:rPr>
+          <w:b/>
+          <w:bCs/>
+        </w:rPr>
+        <w:t>no external structural named; the seat lives inside the design lead</w:t>
+      </w:r>
+      <w:r>
+        <w:t xml:space="preserve"> (verified unannounced as of Jul 2026). </w:t>
       </w:r>
       <w:r>
         <w:rPr>
@@ -1456,17 +1446,20 @@
         <w:t>Win conditions:</w:t>
       </w:r>
       <w:r>
-        <w:t xml:space="preserve"> know which architecture-only firms are entering alliance pursuits, and team </w:t>
-      </w:r>
-      <w:r>
-        <w:rPr>
-          <w:b/>
-          <w:bCs/>
-        </w:rPr>
-        <w:t>before formation</w:t>
-      </w:r>
-      <w:r>
-        <w:t xml:space="preserve">. </w:t>
+        <w:t xml:space="preserve"> </w:t>
+      </w:r>
+      <w:r>
+        <w:t xml:space="preserve">know which architecture-only firms are entering alliance pursuits, and be </w:t>
+      </w:r>
+      <w:r>
+        <w:rPr>
+          <w:b/>
+          <w:bCs/>
+        </w:rPr>
+        <w:t>their</w:t>
+      </w:r>
+      <w:r>
+        <w:t xml:space="preserve"> structural partner before the team forms. </w:t>
       </w:r>
       <w:r>
         <w:rPr>
@@ -1476,10 +1469,7 @@
         <w:t>The play:</w:t>
       </w:r>
       <w:r>
-        <w:t xml:space="preserve"> </w:t>
-      </w:r>
-      <w:r>
-        <w:t>the BC health-capital map (companion report, in production) exists precisely to list the upcoming alliance-model projects and their likely design leads. This is the highest-value repeatable class on KOR’s home turf.</w:t>
+        <w:t xml:space="preserve"> the BC health-capital map (companion report, in production) lists the upcoming alliance-model projects and their likely design leads — the pursuit target is the architect, not the alliance itself.</w:t>
       </w:r>
     </w:p>
     <w:p>
@@ -1504,7 +1494,14 @@
         <w:t>How it works:</w:t>
       </w:r>
       <w:r>
-        <w:t xml:space="preserve"> consortiums lock the full design team at bid. Verified locked examples: Surrey-Langley SkyTrain (Entuitive inside), Broadway Subway, Calgary Green Line, BC Ferries programs, </w:t>
+        <w:t xml:space="preserve"> </w:t>
+      </w:r>
+      <w:r>
+        <w:t xml:space="preserve">consortiums lock the full design team at bid. Verified locked examples: Surrey-Langley SkyTrain (Entuitive inside), Broadway Subway, Calgary Green Line, BC </w:t>
+      </w:r>
+      <w:r>
+        <w:lastRenderedPageBreak/>
+        <w:t xml:space="preserve">Ferries programs, </w:t>
       </w:r>
       <w:r>
         <w:rPr>
@@ -1524,11 +1521,7 @@
         <w:t>The play:</w:t>
       </w:r>
       <w:r>
-        <w:t xml:space="preserve"> either join a consortium at formation (a </w:t>
-      </w:r>
-      <w:r>
-        <w:lastRenderedPageBreak/>
-        <w:t xml:space="preserve">deliberate, priced decision) or consciously spend zero energy. </w:t>
+        <w:t xml:space="preserve"> either join a consortium at formation (a deliberate, priced decision) or consciously spend zero energy. </w:t>
       </w:r>
       <w:r>
         <w:rPr>
@@ -1553,7 +1546,7 @@
     </w:p>
     <w:p>
       <w:r>
-        <w:pict w14:anchorId="105AB52E">
+        <w:pict w14:anchorId="5D8BBB40">
           <v:rect id="_x0000_i1027" style="width:0;height:1.5pt" o:hralign="center" o:hrstd="t" o:hr="t"/>
         </w:pict>
       </w:r>
@@ -1584,10 +1577,7 @@
         <w:t>Winning now:</w:t>
       </w:r>
       <w:r>
-        <w:t xml:space="preserve"> </w:t>
-      </w:r>
-      <w:r>
-        <w:t>Channel 1 (Ledcor/Telus Living + the owner-direct call-sheet). Protect and expand — program-level asks.</w:t>
+        <w:t xml:space="preserve"> Channel 1 (Ledcor/Telus Living + the owner-direct call-sheet). Protect and expand — program-level asks.</w:t>
       </w:r>
     </w:p>
     <w:p>
@@ -1625,7 +1615,10 @@
         <w:t>Underdeveloped:</w:t>
       </w:r>
       <w:r>
-        <w:t xml:space="preserve"> Channel 4 — KOR has GC contacts but no standing design-build teaming slots; the Ledcor and Clark precon relationships are the near-term fix.</w:t>
+        <w:t xml:space="preserve"> </w:t>
+      </w:r>
+      <w:r>
+        <w:t>Channel 4 — KOR has GC contacts but no standing design-build teaming slots; the Ledcor and Clark precon relationships are the near-term fix.</w:t>
       </w:r>
     </w:p>
     <w:p>
@@ -1644,10 +1637,7 @@
         <w:t>Unmapped until now:</w:t>
       </w:r>
       <w:r>
-        <w:t xml:space="preserve"> </w:t>
-      </w:r>
-      <w:r>
-        <w:t>Channel 5 — the companion BC health-capital report converts it into a named target list.</w:t>
+        <w:t xml:space="preserve"> Channel 5 — the companion BC health-capital report converts it into a named target list.</w:t>
       </w:r>
     </w:p>
     <w:p>
@@ -2196,7 +2186,14 @@
               <w:rPr>
                 <w:sz w:val="17"/>
               </w:rPr>
-              <w:t>Kingsway rezoning; Stollery design procurement (~2028); Edmonton Event Park SE</w:t>
+              <w:t xml:space="preserve">Kingsway rezoning; Stollery design procurement </w:t>
+            </w:r>
+            <w:r>
+              <w:rPr>
+                <w:sz w:val="17"/>
+              </w:rPr>
+              <w:lastRenderedPageBreak/>
+              <w:t>(~2028); Edmonton Event Park SE</w:t>
             </w:r>
           </w:p>
         </w:tc>
@@ -2215,6 +2212,7 @@
               <w:rPr>
                 <w:sz w:val="17"/>
               </w:rPr>
+              <w:lastRenderedPageBreak/>
               <w:t>Long-lead; keep warm</w:t>
             </w:r>
           </w:p>
@@ -2228,7 +2226,6 @@
       <w:bookmarkStart w:id="11" w:name="operating-cadence-how-this-stays-alive"/>
       <w:bookmarkEnd w:id="10"/>
       <w:r>
-        <w:lastRenderedPageBreak/>
         <w:t>Operating cadence (how this stays alive)</w:t>
       </w:r>
     </w:p>
@@ -2294,7 +2291,7 @@
     </w:p>
     <w:p>
       <w:r>
-        <w:pict w14:anchorId="02E566AE">
+        <w:pict w14:anchorId="549B7033">
           <v:rect id="_x0000_i1028" style="width:0;height:1.5pt" o:hralign="center" o:hrstd="t" o:hr="t"/>
         </w:pict>
       </w:r>
@@ -2331,7 +2328,7 @@
   <w:abstractNum w:abstractNumId="0" w15:restartNumberingAfterBreak="0">
     <w:nsid w:val="0000A990"/>
     <w:multiLevelType w:val="multilevel"/>
-    <w:tmpl w:val="15D6F278"/>
+    <w:tmpl w:val="87D47070"/>
     <w:lvl w:ilvl="0">
       <w:numFmt w:val="bullet"/>
       <w:lvlText w:val=" "/>
@@ -2408,7 +2405,7 @@
   <w:abstractNum w:abstractNumId="1" w15:restartNumberingAfterBreak="0">
     <w:nsid w:val="0000A991"/>
     <w:multiLevelType w:val="multilevel"/>
-    <w:tmpl w:val="66BA561E"/>
+    <w:tmpl w:val="89307800"/>
     <w:lvl w:ilvl="0">
       <w:numFmt w:val="bullet"/>
       <w:lvlText w:val=""/>
@@ -2512,7 +2509,7 @@
   <w:abstractNum w:abstractNumId="2" w15:restartNumberingAfterBreak="0">
     <w:nsid w:val="00A99411"/>
     <w:multiLevelType w:val="multilevel"/>
-    <w:tmpl w:val="B3762264"/>
+    <w:tmpl w:val="D5F83232"/>
     <w:lvl w:ilvl="0">
       <w:start w:val="1"/>
       <w:numFmt w:val="decimal"/>
@@ -2595,13 +2592,13 @@
       </w:pPr>
     </w:lvl>
   </w:abstractNum>
-  <w:num w:numId="1" w16cid:durableId="508712825">
+  <w:num w:numId="1" w16cid:durableId="1937131248">
     <w:abstractNumId w:val="0"/>
   </w:num>
-  <w:num w:numId="2" w16cid:durableId="1296254703">
+  <w:num w:numId="2" w16cid:durableId="919287364">
     <w:abstractNumId w:val="1"/>
   </w:num>
-  <w:num w:numId="3" w16cid:durableId="1814173059">
+  <w:num w:numId="3" w16cid:durableId="1925264031">
     <w:abstractNumId w:val="2"/>
     <w:lvlOverride w:ilvl="0">
       <w:startOverride w:val="1"/>
@@ -3865,7 +3862,7 @@
     <w:name w:val="Grid Table 4"/>
     <w:basedOn w:val="TableNormal"/>
     <w:uiPriority w:val="49"/>
-    <w:rsid w:val="007F26AB"/>
+    <w:rsid w:val="00ED06C9"/>
     <w:pPr>
       <w:spacing w:after="0"/>
     </w:pPr>

</xml_diff>